<commit_message>
Format docx: justify + 2-char first-line indent (CJK body)
Add tools/format_docx_indent.py: patches word/styles.xml of pandoc docx so
body paragraphs (BodyText, inherited by FirstParagraph) get justified
alignment (jc=both) and a 2-character first-line indent (ind
firstLineChars=200), while lists (Compact) and blockquotes (BlockText) are
reset to firstLineChars=0. Regenerate all four doc .docx with current pandoc
(consistent styles) and apply the formatting. Verified: BodyText has
firstLineChars=200 + jc=both; styles/document XML valid.

Co-Authored-By: Claude Opus 4.8 <noreply@anthropic.com>
</commit_message>
<xml_diff>
--- a/docs/使用说明书_V26.5.34.docx
+++ b/docs/使用说明书_V26.5.34.docx
@@ -9028,6 +9028,8 @@
     <w:qFormat/>
     <w:pPr>
       <w:spacing w:after="180" w:before="180"/>
+      <w:ind w:firstLineChars="200"/>
+      <w:jc w:val="both"/>
     </w:pPr>
   </w:style>
   <w:style w:customStyle="1" w:styleId="FirstParagraph" w:type="paragraph">
@@ -9042,6 +9044,7 @@
     <w:qFormat/>
     <w:pPr>
       <w:spacing w:after="36" w:before="36"/>
+      <w:ind w:firstLineChars="0"/>
     </w:pPr>
   </w:style>
   <w:style w:styleId="Title" w:type="paragraph">
@@ -9504,7 +9507,7 @@
     <w:qFormat/>
     <w:pPr>
       <w:spacing w:after="100" w:before="100"/>
-      <w:ind w:firstLine="0" w:left="480" w:right="480"/>
+      <w:ind w:firstLineChars="0" w:firstLine="0" w:left="480" w:right="480"/>
     </w:pPr>
   </w:style>
   <w:style w:styleId="FootnoteText" w:type="paragraph">

</xml_diff>

<commit_message>
Draw full gridlines on all docx tables
Extend format_docx_indent.py: inject full tblBorders (top/left/bottom/right/
insideH/insideV, 0.5pt black) directly into each table's tblPr in
document.xml, so every horizontal (and vertical) line is drawn instead of the
pandoc three-line style. Make the indent patch idempotent (skip if already
applied) so the script is safe to re-run. Applied to 软件说明 (5 tables),
使用说明书 (9), 理论公式 (1). 软件开发文档 pending (file was locked/open).

Co-Authored-By: Claude Opus 4.8 <noreply@anthropic.com>
</commit_message>
<xml_diff>
--- a/docs/使用说明书_V26.5.34.docx
+++ b/docs/使用说明书_V26.5.34.docx
@@ -715,6 +715,14 @@
       <w:tblPr>
         <w:tblStyle w:val="Table"/>
         <w:tblW w:type="pct" w:w="5000"/>
+        <w:tblBorders>
+          <w:top w:val="single" w:sz="4" w:space="0" w:color="auto"/>
+          <w:left w:val="single" w:sz="4" w:space="0" w:color="auto"/>
+          <w:bottom w:val="single" w:sz="4" w:space="0" w:color="auto"/>
+          <w:right w:val="single" w:sz="4" w:space="0" w:color="auto"/>
+          <w:insideH w:val="single" w:sz="4" w:space="0" w:color="auto"/>
+          <w:insideV w:val="single" w:sz="4" w:space="0" w:color="auto"/>
+        </w:tblBorders>
         <w:tblLayout w:type="fixed"/>
         <w:tblLook w:firstRow="1" w:lastRow="0" w:firstColumn="0" w:lastColumn="0" w:noHBand="0" w:noVBand="0" w:val="0020"/>
       </w:tblPr>
@@ -1498,6 +1506,14 @@
       <w:tblPr>
         <w:tblStyle w:val="Table"/>
         <w:tblW w:type="pct" w:w="5000"/>
+        <w:tblBorders>
+          <w:top w:val="single" w:sz="4" w:space="0" w:color="auto"/>
+          <w:left w:val="single" w:sz="4" w:space="0" w:color="auto"/>
+          <w:bottom w:val="single" w:sz="4" w:space="0" w:color="auto"/>
+          <w:right w:val="single" w:sz="4" w:space="0" w:color="auto"/>
+          <w:insideH w:val="single" w:sz="4" w:space="0" w:color="auto"/>
+          <w:insideV w:val="single" w:sz="4" w:space="0" w:color="auto"/>
+        </w:tblBorders>
         <w:tblLayout w:type="fixed"/>
         <w:tblLook w:firstRow="1" w:lastRow="0" w:firstColumn="0" w:lastColumn="0" w:noHBand="0" w:noVBand="0" w:val="0020"/>
       </w:tblPr>
@@ -1871,6 +1887,14 @@
       <w:tblPr>
         <w:tblStyle w:val="Table"/>
         <w:tblW w:type="pct" w:w="5000"/>
+        <w:tblBorders>
+          <w:top w:val="single" w:sz="4" w:space="0" w:color="auto"/>
+          <w:left w:val="single" w:sz="4" w:space="0" w:color="auto"/>
+          <w:bottom w:val="single" w:sz="4" w:space="0" w:color="auto"/>
+          <w:right w:val="single" w:sz="4" w:space="0" w:color="auto"/>
+          <w:insideH w:val="single" w:sz="4" w:space="0" w:color="auto"/>
+          <w:insideV w:val="single" w:sz="4" w:space="0" w:color="auto"/>
+        </w:tblBorders>
         <w:tblLayout w:type="fixed"/>
         <w:tblLook w:firstRow="1" w:lastRow="0" w:firstColumn="0" w:lastColumn="0" w:noHBand="0" w:noVBand="0" w:val="0020"/>
       </w:tblPr>
@@ -2415,6 +2439,14 @@
         <w:tblStyle w:val="Table"/>
         <w:tblW w:type="auto" w:w="0"/>
         <w:tblLook w:firstRow="1" w:lastRow="0" w:firstColumn="0" w:lastColumn="0" w:noHBand="0" w:noVBand="0" w:val="0020"/>
+        <w:tblBorders>
+          <w:top w:val="single" w:sz="4" w:space="0" w:color="auto"/>
+          <w:left w:val="single" w:sz="4" w:space="0" w:color="auto"/>
+          <w:bottom w:val="single" w:sz="4" w:space="0" w:color="auto"/>
+          <w:right w:val="single" w:sz="4" w:space="0" w:color="auto"/>
+          <w:insideH w:val="single" w:sz="4" w:space="0" w:color="auto"/>
+          <w:insideV w:val="single" w:sz="4" w:space="0" w:color="auto"/>
+        </w:tblBorders>
       </w:tblPr>
       <w:tblGrid>
         <w:gridCol w:w="3960"/>
@@ -2580,6 +2612,14 @@
         <w:tblStyle w:val="Table"/>
         <w:tblW w:type="auto" w:w="0"/>
         <w:tblLook w:firstRow="1" w:lastRow="0" w:firstColumn="0" w:lastColumn="0" w:noHBand="0" w:noVBand="0" w:val="0020"/>
+        <w:tblBorders>
+          <w:top w:val="single" w:sz="4" w:space="0" w:color="auto"/>
+          <w:left w:val="single" w:sz="4" w:space="0" w:color="auto"/>
+          <w:bottom w:val="single" w:sz="4" w:space="0" w:color="auto"/>
+          <w:right w:val="single" w:sz="4" w:space="0" w:color="auto"/>
+          <w:insideH w:val="single" w:sz="4" w:space="0" w:color="auto"/>
+          <w:insideV w:val="single" w:sz="4" w:space="0" w:color="auto"/>
+        </w:tblBorders>
       </w:tblPr>
       <w:tblGrid>
         <w:gridCol w:w="3960"/>
@@ -4471,6 +4511,14 @@
       <w:tblPr>
         <w:tblStyle w:val="Table"/>
         <w:tblW w:type="pct" w:w="5000"/>
+        <w:tblBorders>
+          <w:top w:val="single" w:sz="4" w:space="0" w:color="auto"/>
+          <w:left w:val="single" w:sz="4" w:space="0" w:color="auto"/>
+          <w:bottom w:val="single" w:sz="4" w:space="0" w:color="auto"/>
+          <w:right w:val="single" w:sz="4" w:space="0" w:color="auto"/>
+          <w:insideH w:val="single" w:sz="4" w:space="0" w:color="auto"/>
+          <w:insideV w:val="single" w:sz="4" w:space="0" w:color="auto"/>
+        </w:tblBorders>
         <w:tblLayout w:type="fixed"/>
         <w:tblLook w:firstRow="1" w:lastRow="0" w:firstColumn="0" w:lastColumn="0" w:noHBand="0" w:noVBand="0" w:val="0020"/>
       </w:tblPr>
@@ -5774,6 +5822,14 @@
       <w:tblPr>
         <w:tblStyle w:val="Table"/>
         <w:tblW w:type="pct" w:w="5000"/>
+        <w:tblBorders>
+          <w:top w:val="single" w:sz="4" w:space="0" w:color="auto"/>
+          <w:left w:val="single" w:sz="4" w:space="0" w:color="auto"/>
+          <w:bottom w:val="single" w:sz="4" w:space="0" w:color="auto"/>
+          <w:right w:val="single" w:sz="4" w:space="0" w:color="auto"/>
+          <w:insideH w:val="single" w:sz="4" w:space="0" w:color="auto"/>
+          <w:insideV w:val="single" w:sz="4" w:space="0" w:color="auto"/>
+        </w:tblBorders>
         <w:tblLayout w:type="fixed"/>
         <w:tblLook w:firstRow="1" w:lastRow="0" w:firstColumn="0" w:lastColumn="0" w:noHBand="0" w:noVBand="0" w:val="0020"/>
       </w:tblPr>
@@ -7140,6 +7196,14 @@
       <w:tblPr>
         <w:tblStyle w:val="Table"/>
         <w:tblW w:type="pct" w:w="5000"/>
+        <w:tblBorders>
+          <w:top w:val="single" w:sz="4" w:space="0" w:color="auto"/>
+          <w:left w:val="single" w:sz="4" w:space="0" w:color="auto"/>
+          <w:bottom w:val="single" w:sz="4" w:space="0" w:color="auto"/>
+          <w:right w:val="single" w:sz="4" w:space="0" w:color="auto"/>
+          <w:insideH w:val="single" w:sz="4" w:space="0" w:color="auto"/>
+          <w:insideV w:val="single" w:sz="4" w:space="0" w:color="auto"/>
+        </w:tblBorders>
         <w:tblLayout w:type="fixed"/>
         <w:tblLook w:firstRow="1" w:lastRow="0" w:firstColumn="0" w:lastColumn="0" w:noHBand="0" w:noVBand="0" w:val="0020"/>
       </w:tblPr>
@@ -7627,6 +7691,14 @@
       <w:tblPr>
         <w:tblStyle w:val="Table"/>
         <w:tblW w:type="pct" w:w="5000"/>
+        <w:tblBorders>
+          <w:top w:val="single" w:sz="4" w:space="0" w:color="auto"/>
+          <w:left w:val="single" w:sz="4" w:space="0" w:color="auto"/>
+          <w:bottom w:val="single" w:sz="4" w:space="0" w:color="auto"/>
+          <w:right w:val="single" w:sz="4" w:space="0" w:color="auto"/>
+          <w:insideH w:val="single" w:sz="4" w:space="0" w:color="auto"/>
+          <w:insideV w:val="single" w:sz="4" w:space="0" w:color="auto"/>
+        </w:tblBorders>
         <w:tblLayout w:type="fixed"/>
         <w:tblLook w:firstRow="1" w:lastRow="0" w:firstColumn="0" w:lastColumn="0" w:noHBand="0" w:noVBand="0" w:val="0020"/>
       </w:tblPr>

</xml_diff>